<commit_message>
docs(outreach): part 2, the fast lane
Firms that place you into their own openings rather than hold a CV:
seven boutique IT staffing firms on the EZEU pattern (EZEU itself,
Cybotrix pay-after-placement, WSNE, Bloom, TeamPlus, SRI Tech, Hyring),
two free vetted-placement routes (Pesto, which names MERN and requires
4+ years; Talent500 for GCC roles), and six apply-for-you services with
their fees quoted verbatim, including the two true success-fee models.

Also the MEA rule for overseas agents (licence on emigrate.gov.in, fee
cap of 30,000 rupees plus GST) and a one-paragraph note on the
pay-after-placement training programmes so they are recognisable.

Every URL fetched and returned 200. Pages that would not render (ezeu.in,
Find My Profession's service page) are noted as such rather than
summarised from memory. The earlier Pesto income-share flag is withdrawn
on the strength of their current developer page.

Co-Authored-By: Claude Fable 5.1 <noreply@anthropic.com>
</commit_message>
<xml_diff>
--- a/docs/consultancy-outreach-list.docx
+++ b/docs/consultancy-outreach-list.docx
@@ -6547,6 +6547,2000 @@
       </w:r>
       <w:r>
         <w:t xml:space="preserve"> are the ones stated explicitly on their own sites. An offer from a Gmail address claiming to be a staffing firm is a scam, and several of these firms say so themselves. Michael Page UAE specifically warns about impersonation over WhatsApp and Telegram.</w:t>
+      </w:r>
+    </w:p>
+    <w:p>
+      <w:pPr>
+        <w:pStyle w:val="Title"/>
+      </w:pPr>
+      <w:r>
+        <w:t>Part 2: the fast lane</w:t>
+      </w:r>
+    </w:p>
+    <w:p>
+      <w:r>
+        <w:t xml:space="preserve">Added 2026-10-22. Part 1 is large agencies that keep a database. This part is the firms that </w:t>
+      </w:r>
+      <w:r>
+        <w:rPr>
+          <w:b/>
+        </w:rPr>
+        <w:t>push you into an opening themselves</w:t>
+      </w:r>
+      <w:r>
+        <w:t xml:space="preserve">, plus the services you can </w:t>
+      </w:r>
+      <w:r>
+        <w:rPr>
+          <w:b/>
+        </w:rPr>
+        <w:t>pay after placement</w:t>
+      </w:r>
+      <w:r>
+        <w:t xml:space="preserve"> to do the applying for you. Every URL and fee here was read from the firm's own page on 2026-10-22; where a page would not load or said nothing, it says so.</w:t>
+      </w:r>
+    </w:p>
+    <w:p>
+      <w:r>
+        <w:t>The model you asked for by name, EZEU, is a small Bengaluru staffing-and- training firm (founded 2020, under 20 people) that posts developer openings and takes CVs for them directly. §10 is firms that work the same way.</w:t>
+      </w:r>
+    </w:p>
+    <w:p>
+      <w:pPr>
+        <w:pStyle w:val="Heading1"/>
+      </w:pPr>
+      <w:r>
+        <w:t>10. Boutique IT staffing firms (the EZEU pattern)</w:t>
+      </w:r>
+    </w:p>
+    <w:p>
+      <w:r>
+        <w:t>Employer-paid. They hold live client mandates and place you into one; you are not in a database waiting to be searched. Small, so one email reaches a human.</w:t>
+      </w:r>
+    </w:p>
+    <w:tbl>
+      <w:tblPr>
+        <w:tblStyle w:val="TableGrid"/>
+        <w:tblW w:type="auto" w:w="0"/>
+        <w:jc w:val="center"/>
+        <w:tblLook w:firstColumn="1" w:firstRow="1" w:lastColumn="0" w:lastRow="0" w:noHBand="0" w:noVBand="1" w:val="04A0"/>
+      </w:tblPr>
+      <w:tblGrid>
+        <w:gridCol w:w="2660"/>
+        <w:gridCol w:w="2660"/>
+        <w:gridCol w:w="2660"/>
+        <w:gridCol w:w="2660"/>
+      </w:tblGrid>
+      <w:tr>
+        <w:tc>
+          <w:tcPr>
+            <w:tcW w:type="dxa" w:w="2660"/>
+            <w:shd w:val="clear" w:color="auto" w:fill="F5F5F4"/>
+          </w:tcPr>
+          <w:p>
+            <w:pPr>
+              <w:spacing w:after="0"/>
+            </w:pPr>
+            <w:r>
+              <w:rPr>
+                <w:b/>
+                <w:sz w:val="19"/>
+              </w:rPr>
+              <w:t>firm</w:t>
+            </w:r>
+          </w:p>
+        </w:tc>
+        <w:tc>
+          <w:tcPr>
+            <w:tcW w:type="dxa" w:w="2660"/>
+            <w:shd w:val="clear" w:color="auto" w:fill="F5F5F4"/>
+          </w:tcPr>
+          <w:p>
+            <w:pPr>
+              <w:spacing w:after="0"/>
+            </w:pPr>
+            <w:r>
+              <w:rPr>
+                <w:b/>
+                <w:sz w:val="19"/>
+              </w:rPr>
+              <w:t>where to apply</w:t>
+            </w:r>
+          </w:p>
+        </w:tc>
+        <w:tc>
+          <w:tcPr>
+            <w:tcW w:type="dxa" w:w="2660"/>
+            <w:shd w:val="clear" w:color="auto" w:fill="F5F5F4"/>
+          </w:tcPr>
+          <w:p>
+            <w:pPr>
+              <w:spacing w:after="0"/>
+            </w:pPr>
+            <w:r>
+              <w:rPr>
+                <w:b/>
+                <w:sz w:val="19"/>
+              </w:rPr>
+              <w:t>contact</w:t>
+            </w:r>
+          </w:p>
+        </w:tc>
+        <w:tc>
+          <w:tcPr>
+            <w:tcW w:type="dxa" w:w="2660"/>
+            <w:shd w:val="clear" w:color="auto" w:fill="F5F5F4"/>
+          </w:tcPr>
+          <w:p>
+            <w:pPr>
+              <w:spacing w:after="0"/>
+            </w:pPr>
+            <w:r>
+              <w:rPr>
+                <w:b/>
+                <w:sz w:val="19"/>
+              </w:rPr>
+              <w:t>notes</w:t>
+            </w:r>
+          </w:p>
+        </w:tc>
+      </w:tr>
+      <w:tr>
+        <w:tc>
+          <w:tcPr>
+            <w:tcW w:type="dxa" w:w="2660"/>
+          </w:tcPr>
+          <w:p>
+            <w:pPr>
+              <w:spacing w:after="0"/>
+            </w:pPr>
+            <w:r>
+              <w:rPr>
+                <w:b/>
+                <w:sz w:val="19"/>
+              </w:rPr>
+              <w:t>EZEU (OPC) India</w:t>
+            </w:r>
+          </w:p>
+        </w:tc>
+        <w:tc>
+          <w:tcPr>
+            <w:tcW w:type="dxa" w:w="2660"/>
+          </w:tcPr>
+          <w:p>
+            <w:pPr>
+              <w:spacing w:after="0"/>
+            </w:pPr>
+            <w:hyperlink r:id="rId97">
+              <w:r>
+                <w:rPr>
+                  <w:color w:val="7F1D3A"/>
+                  <w:u w:val="single"/>
+                  <w:sz w:val="19"/>
+                </w:rPr>
+                <w:t xml:space="preserve">cutshort.io/company/ezeu-opc-india-pvt-ltd-42-ix0UKabI</w:t>
+              </w:r>
+            </w:hyperlink>
+          </w:p>
+        </w:tc>
+        <w:tc>
+          <w:tcPr>
+            <w:tcW w:type="dxa" w:w="2660"/>
+          </w:tcPr>
+          <w:p>
+            <w:pPr>
+              <w:spacing w:after="0"/>
+            </w:pPr>
+            <w:r>
+              <w:rPr>
+                <w:sz w:val="19"/>
+              </w:rPr>
+              <w:t xml:space="preserve">no email published; recruiter is Lakshmi PH on LinkedIn · </w:t>
+            </w:r>
+            <w:hyperlink r:id="rId98">
+              <w:r>
+                <w:rPr>
+                  <w:color w:val="7F1D3A"/>
+                  <w:u w:val="single"/>
+                  <w:sz w:val="19"/>
+                </w:rPr>
+                <w:t xml:space="preserve">linkedin.com/company/ezeu-opc-india-pvt-limited</w:t>
+              </w:r>
+            </w:hyperlink>
+          </w:p>
+        </w:tc>
+        <w:tc>
+          <w:tcPr>
+            <w:tcW w:type="dxa" w:w="2660"/>
+          </w:tcPr>
+          <w:p>
+            <w:pPr>
+              <w:spacing w:after="0"/>
+            </w:pPr>
+            <w:r>
+              <w:rPr>
+                <w:sz w:val="19"/>
+              </w:rPr>
+              <w:t>Bengaluru + Pune. Open roles 2–15 yrs: Java full stack ₹10–25L, SDET, UI/UX engineer ₹9–36L, DevSecOps, Azure architect. Cutshort flags the recruiter as "not active recently", so expect delays</w:t>
+            </w:r>
+          </w:p>
+        </w:tc>
+      </w:tr>
+      <w:tr>
+        <w:tc>
+          <w:tcPr>
+            <w:tcW w:type="dxa" w:w="2660"/>
+          </w:tcPr>
+          <w:p>
+            <w:pPr>
+              <w:spacing w:after="0"/>
+            </w:pPr>
+            <w:r>
+              <w:rPr>
+                <w:b/>
+                <w:sz w:val="19"/>
+              </w:rPr>
+              <w:t>Cybotrix Technologies</w:t>
+            </w:r>
+          </w:p>
+        </w:tc>
+        <w:tc>
+          <w:tcPr>
+            <w:tcW w:type="dxa" w:w="2660"/>
+          </w:tcPr>
+          <w:p>
+            <w:pPr>
+              <w:spacing w:after="0"/>
+            </w:pPr>
+            <w:hyperlink r:id="rId99">
+              <w:r>
+                <w:rPr>
+                  <w:color w:val="7F1D3A"/>
+                  <w:u w:val="single"/>
+                  <w:sz w:val="19"/>
+                </w:rPr>
+                <w:t xml:space="preserve">cybotrix.com/signup.html</w:t>
+              </w:r>
+            </w:hyperlink>
+          </w:p>
+        </w:tc>
+        <w:tc>
+          <w:tcPr>
+            <w:tcW w:type="dxa" w:w="2660"/>
+          </w:tcPr>
+          <w:p>
+            <w:pPr>
+              <w:spacing w:after="0"/>
+            </w:pPr>
+            <w:r>
+              <w:rPr>
+                <w:rFonts w:ascii="Consolas" w:hAnsi="Consolas"/>
+                <w:sz w:val="17"/>
+              </w:rPr>
+              <w:t>contact@cybotrix.com</w:t>
+            </w:r>
+          </w:p>
+        </w:tc>
+        <w:tc>
+          <w:tcPr>
+            <w:tcW w:type="dxa" w:w="2660"/>
+          </w:tcPr>
+          <w:p>
+            <w:pPr>
+              <w:spacing w:after="0"/>
+            </w:pPr>
+            <w:r>
+              <w:rPr>
+                <w:sz w:val="19"/>
+              </w:rPr>
+              <w:t xml:space="preserve">Bengaluru primary, lists Hyderabad, Pune, Chennai and 20 more cities. Roles: full stack MERN / MEAN / Java / .NET, Python, testing. </w:t>
+            </w:r>
+            <w:r>
+              <w:rPr>
+                <w:b/>
+                <w:sz w:val="19"/>
+              </w:rPr>
+              <w:t>Pay-after-placement</w:t>
+            </w:r>
+            <w:r>
+              <w:rPr>
+                <w:sz w:val="19"/>
+              </w:rPr>
+              <w:t>: fee settled after offer letter and joining; lateral band quoted ₹4–10 LPA+. Page contradicts itself ("No registration fee" banner vs "smaller registration fee if applicable"), so get the exact amount and trigger in writing before signing</w:t>
+            </w:r>
+          </w:p>
+        </w:tc>
+      </w:tr>
+      <w:tr>
+        <w:tc>
+          <w:tcPr>
+            <w:tcW w:type="dxa" w:w="2660"/>
+          </w:tcPr>
+          <w:p>
+            <w:pPr>
+              <w:spacing w:after="0"/>
+            </w:pPr>
+            <w:r>
+              <w:rPr>
+                <w:b/>
+                <w:sz w:val="19"/>
+              </w:rPr>
+              <w:t>WSNE Consulting</w:t>
+            </w:r>
+          </w:p>
+        </w:tc>
+        <w:tc>
+          <w:tcPr>
+            <w:tcW w:type="dxa" w:w="2660"/>
+          </w:tcPr>
+          <w:p>
+            <w:pPr>
+              <w:spacing w:after="0"/>
+            </w:pPr>
+            <w:hyperlink r:id="rId100">
+              <w:r>
+                <w:rPr>
+                  <w:color w:val="7F1D3A"/>
+                  <w:u w:val="single"/>
+                  <w:sz w:val="19"/>
+                </w:rPr>
+                <w:t xml:space="preserve">wsneconsulting.com/submit-resume</w:t>
+              </w:r>
+            </w:hyperlink>
+          </w:p>
+        </w:tc>
+        <w:tc>
+          <w:tcPr>
+            <w:tcW w:type="dxa" w:w="2660"/>
+          </w:tcPr>
+          <w:p>
+            <w:pPr>
+              <w:spacing w:after="0"/>
+            </w:pPr>
+            <w:r>
+              <w:rPr>
+                <w:rFonts w:ascii="Consolas" w:hAnsi="Consolas"/>
+                <w:sz w:val="17"/>
+              </w:rPr>
+              <w:t>info@wsneconsulting.com</w:t>
+            </w:r>
+          </w:p>
+        </w:tc>
+        <w:tc>
+          <w:tcPr>
+            <w:tcW w:type="dxa" w:w="2660"/>
+          </w:tcPr>
+          <w:p>
+            <w:pPr>
+              <w:spacing w:after="0"/>
+            </w:pPr>
+            <w:r>
+              <w:rPr>
+                <w:sz w:val="19"/>
+              </w:rPr>
+              <w:t>Contract staffing, 3–24 month contracts. Full Stack, DevOps, AI/ML, Cloud, SRE. Bengaluru coverage; offices Delhi NCR and Dehradun</w:t>
+            </w:r>
+          </w:p>
+        </w:tc>
+      </w:tr>
+      <w:tr>
+        <w:tc>
+          <w:tcPr>
+            <w:tcW w:type="dxa" w:w="2660"/>
+          </w:tcPr>
+          <w:p>
+            <w:pPr>
+              <w:spacing w:after="0"/>
+            </w:pPr>
+            <w:r>
+              <w:rPr>
+                <w:b/>
+                <w:sz w:val="19"/>
+              </w:rPr>
+              <w:t>Bloom Solutions</w:t>
+            </w:r>
+          </w:p>
+        </w:tc>
+        <w:tc>
+          <w:tcPr>
+            <w:tcW w:type="dxa" w:w="2660"/>
+          </w:tcPr>
+          <w:p>
+            <w:pPr>
+              <w:spacing w:after="0"/>
+            </w:pPr>
+            <w:r>
+              <w:rPr>
+                <w:sz w:val="19"/>
+              </w:rPr>
+              <w:t xml:space="preserve">contact form, pick </w:t>
+            </w:r>
+            <w:r>
+              <w:rPr>
+                <w:b/>
+                <w:sz w:val="19"/>
+              </w:rPr>
+              <w:t>I am a Job Seeker</w:t>
+            </w:r>
+          </w:p>
+        </w:tc>
+        <w:tc>
+          <w:tcPr>
+            <w:tcW w:type="dxa" w:w="2660"/>
+          </w:tcPr>
+          <w:p>
+            <w:pPr>
+              <w:spacing w:after="0"/>
+            </w:pPr>
+            <w:r>
+              <w:rPr>
+                <w:rFonts w:ascii="Consolas" w:hAnsi="Consolas"/>
+                <w:sz w:val="17"/>
+              </w:rPr>
+              <w:t>info@bloomsolutions.com</w:t>
+            </w:r>
+            <w:r>
+              <w:rPr>
+                <w:sz w:val="19"/>
+              </w:rPr>
+              <w:t xml:space="preserve"> · WhatsApp </w:t>
+            </w:r>
+            <w:r>
+              <w:rPr>
+                <w:rFonts w:ascii="Consolas" w:hAnsi="Consolas"/>
+                <w:sz w:val="17"/>
+              </w:rPr>
+              <w:t>+91 974 279 9038</w:t>
+            </w:r>
+          </w:p>
+        </w:tc>
+        <w:tc>
+          <w:tcPr>
+            <w:tcW w:type="dxa" w:w="2660"/>
+          </w:tcPr>
+          <w:p>
+            <w:pPr>
+              <w:spacing w:after="0"/>
+            </w:pPr>
+            <w:r>
+              <w:rPr>
+                <w:sz w:val="19"/>
+              </w:rPr>
+              <w:t>Bengaluru (Yelahanka). Full-stack, React / Angular, Java / .NET, DevOps, AWS / Azure, AI/ML</w:t>
+            </w:r>
+          </w:p>
+        </w:tc>
+      </w:tr>
+      <w:tr>
+        <w:tc>
+          <w:tcPr>
+            <w:tcW w:type="dxa" w:w="2660"/>
+          </w:tcPr>
+          <w:p>
+            <w:pPr>
+              <w:spacing w:after="0"/>
+            </w:pPr>
+            <w:r>
+              <w:rPr>
+                <w:b/>
+                <w:sz w:val="19"/>
+              </w:rPr>
+              <w:t>TeamPlus Staffing</w:t>
+            </w:r>
+          </w:p>
+        </w:tc>
+        <w:tc>
+          <w:tcPr>
+            <w:tcW w:type="dxa" w:w="2660"/>
+          </w:tcPr>
+          <w:p>
+            <w:pPr>
+              <w:spacing w:after="0"/>
+            </w:pPr>
+            <w:r>
+              <w:rPr>
+                <w:sz w:val="19"/>
+              </w:rPr>
+              <w:t>careers section on teamplusindia.in</w:t>
+            </w:r>
+          </w:p>
+        </w:tc>
+        <w:tc>
+          <w:tcPr>
+            <w:tcW w:type="dxa" w:w="2660"/>
+          </w:tcPr>
+          <w:p>
+            <w:pPr>
+              <w:spacing w:after="0"/>
+            </w:pPr>
+            <w:r>
+              <w:rPr>
+                <w:rFonts w:ascii="Consolas" w:hAnsi="Consolas"/>
+                <w:sz w:val="17"/>
+              </w:rPr>
+              <w:t>hr@teamplusindia.in</w:t>
+            </w:r>
+            <w:r>
+              <w:rPr>
+                <w:sz w:val="19"/>
+              </w:rPr>
+              <w:t xml:space="preserve"> · </w:t>
+            </w:r>
+            <w:r>
+              <w:rPr>
+                <w:rFonts w:ascii="Consolas" w:hAnsi="Consolas"/>
+                <w:sz w:val="17"/>
+              </w:rPr>
+              <w:t>+91 80 6217 8320</w:t>
+            </w:r>
+          </w:p>
+        </w:tc>
+        <w:tc>
+          <w:tcPr>
+            <w:tcW w:type="dxa" w:w="2660"/>
+          </w:tcPr>
+          <w:p>
+            <w:pPr>
+              <w:spacing w:after="0"/>
+            </w:pPr>
+            <w:r>
+              <w:rPr>
+                <w:sz w:val="19"/>
+              </w:rPr>
+              <w:t>Offices Mumbai and Pune, Hyderabad coverage. Python, Android, PHP, app developers</w:t>
+            </w:r>
+          </w:p>
+        </w:tc>
+      </w:tr>
+      <w:tr>
+        <w:tc>
+          <w:tcPr>
+            <w:tcW w:type="dxa" w:w="2660"/>
+          </w:tcPr>
+          <w:p>
+            <w:pPr>
+              <w:spacing w:after="0"/>
+            </w:pPr>
+            <w:r>
+              <w:rPr>
+                <w:b/>
+                <w:sz w:val="19"/>
+              </w:rPr>
+              <w:t>SRI Tech Solutions</w:t>
+            </w:r>
+          </w:p>
+        </w:tc>
+        <w:tc>
+          <w:tcPr>
+            <w:tcW w:type="dxa" w:w="2660"/>
+          </w:tcPr>
+          <w:p>
+            <w:pPr>
+              <w:spacing w:after="0"/>
+            </w:pPr>
+            <w:hyperlink r:id="rId101">
+              <w:r>
+                <w:rPr>
+                  <w:color w:val="7F1D3A"/>
+                  <w:u w:val="single"/>
+                  <w:sz w:val="19"/>
+                </w:rPr>
+                <w:t xml:space="preserve">sritechsolutions.com</w:t>
+              </w:r>
+            </w:hyperlink>
+            <w:r>
+              <w:rPr>
+                <w:sz w:val="19"/>
+              </w:rPr>
+              <w:t xml:space="preserve"> → Careers → Current Openings</w:t>
+            </w:r>
+          </w:p>
+        </w:tc>
+        <w:tc>
+          <w:tcPr>
+            <w:tcW w:type="dxa" w:w="2660"/>
+          </w:tcPr>
+          <w:p>
+            <w:pPr>
+              <w:spacing w:after="0"/>
+            </w:pPr>
+            <w:r>
+              <w:rPr>
+                <w:rFonts w:ascii="Consolas" w:hAnsi="Consolas"/>
+                <w:sz w:val="17"/>
+              </w:rPr>
+              <w:t>info@sritechsolutions.com</w:t>
+            </w:r>
+          </w:p>
+        </w:tc>
+        <w:tc>
+          <w:tcPr>
+            <w:tcW w:type="dxa" w:w="2660"/>
+          </w:tcPr>
+          <w:p>
+            <w:pPr>
+              <w:spacing w:after="0"/>
+            </w:pPr>
+            <w:r>
+              <w:rPr>
+                <w:sz w:val="19"/>
+              </w:rPr>
+              <w:t>Hyderabad staffing, US phone. Full Stack, AI/ML, Cloud, DevOps</w:t>
+            </w:r>
+          </w:p>
+        </w:tc>
+      </w:tr>
+      <w:tr>
+        <w:tc>
+          <w:tcPr>
+            <w:tcW w:type="dxa" w:w="2660"/>
+          </w:tcPr>
+          <w:p>
+            <w:pPr>
+              <w:spacing w:after="0"/>
+            </w:pPr>
+            <w:r>
+              <w:rPr>
+                <w:b/>
+                <w:sz w:val="19"/>
+              </w:rPr>
+              <w:t>Hyring</w:t>
+            </w:r>
+          </w:p>
+        </w:tc>
+        <w:tc>
+          <w:tcPr>
+            <w:tcW w:type="dxa" w:w="2660"/>
+          </w:tcPr>
+          <w:p>
+            <w:pPr>
+              <w:spacing w:after="0"/>
+            </w:pPr>
+            <w:hyperlink r:id="rId102">
+              <w:r>
+                <w:rPr>
+                  <w:color w:val="7F1D3A"/>
+                  <w:u w:val="single"/>
+                  <w:sz w:val="19"/>
+                </w:rPr>
+                <w:t xml:space="preserve">hyring.com</w:t>
+              </w:r>
+            </w:hyperlink>
+            <w:r>
+              <w:rPr>
+                <w:sz w:val="19"/>
+              </w:rPr>
+              <w:t xml:space="preserve"> → Join as a jobseeker</w:t>
+            </w:r>
+          </w:p>
+        </w:tc>
+        <w:tc>
+          <w:tcPr>
+            <w:tcW w:type="dxa" w:w="2660"/>
+          </w:tcPr>
+          <w:p>
+            <w:pPr>
+              <w:spacing w:after="0"/>
+            </w:pPr>
+            <w:r>
+              <w:rPr>
+                <w:sz w:val="19"/>
+              </w:rPr>
+              <w:t>none published</w:t>
+            </w:r>
+          </w:p>
+        </w:tc>
+        <w:tc>
+          <w:tcPr>
+            <w:tcW w:type="dxa" w:w="2660"/>
+          </w:tcPr>
+          <w:p>
+            <w:pPr>
+              <w:spacing w:after="0"/>
+            </w:pPr>
+            <w:r>
+              <w:rPr>
+                <w:sz w:val="19"/>
+              </w:rPr>
+              <w:t>Platform, not an agency: free for candidates, auto-apply plus a marketplace of recruiting partners who place you for a commission the employer pays</w:t>
+            </w:r>
+          </w:p>
+        </w:tc>
+      </w:tr>
+    </w:tbl>
+    <w:p/>
+    <w:p>
+      <w:r>
+        <w:t>None of these charge a candidate except Cybotrix, and Cybotrix only after you join.</w:t>
+      </w:r>
+    </w:p>
+    <w:p>
+      <w:pPr>
+        <w:pStyle w:val="Heading1"/>
+      </w:pPr>
+      <w:r>
+        <w:t>11. Vetted placement into remote and GCC roles, free to you</w:t>
+      </w:r>
+    </w:p>
+    <w:tbl>
+      <w:tblPr>
+        <w:tblStyle w:val="TableGrid"/>
+        <w:tblW w:type="auto" w:w="0"/>
+        <w:jc w:val="center"/>
+        <w:tblLook w:firstColumn="1" w:firstRow="1" w:lastColumn="0" w:lastRow="0" w:noHBand="0" w:noVBand="1" w:val="04A0"/>
+      </w:tblPr>
+      <w:tblGrid>
+        <w:gridCol w:w="2660"/>
+        <w:gridCol w:w="2660"/>
+        <w:gridCol w:w="2660"/>
+        <w:gridCol w:w="2660"/>
+      </w:tblGrid>
+      <w:tr>
+        <w:tc>
+          <w:tcPr>
+            <w:tcW w:type="dxa" w:w="2660"/>
+            <w:shd w:val="clear" w:color="auto" w:fill="F5F5F4"/>
+          </w:tcPr>
+          <w:p>
+            <w:pPr>
+              <w:spacing w:after="0"/>
+            </w:pPr>
+            <w:r>
+              <w:rPr>
+                <w:b/>
+                <w:sz w:val="19"/>
+              </w:rPr>
+              <w:t>firm</w:t>
+            </w:r>
+          </w:p>
+        </w:tc>
+        <w:tc>
+          <w:tcPr>
+            <w:tcW w:type="dxa" w:w="2660"/>
+            <w:shd w:val="clear" w:color="auto" w:fill="F5F5F4"/>
+          </w:tcPr>
+          <w:p>
+            <w:pPr>
+              <w:spacing w:after="0"/>
+            </w:pPr>
+            <w:r>
+              <w:rPr>
+                <w:b/>
+                <w:sz w:val="19"/>
+              </w:rPr>
+              <w:t>where to apply</w:t>
+            </w:r>
+          </w:p>
+        </w:tc>
+        <w:tc>
+          <w:tcPr>
+            <w:tcW w:type="dxa" w:w="2660"/>
+            <w:shd w:val="clear" w:color="auto" w:fill="F5F5F4"/>
+          </w:tcPr>
+          <w:p>
+            <w:pPr>
+              <w:spacing w:after="0"/>
+            </w:pPr>
+            <w:r>
+              <w:rPr>
+                <w:b/>
+                <w:sz w:val="19"/>
+              </w:rPr>
+              <w:t>fee</w:t>
+            </w:r>
+          </w:p>
+        </w:tc>
+        <w:tc>
+          <w:tcPr>
+            <w:tcW w:type="dxa" w:w="2660"/>
+            <w:shd w:val="clear" w:color="auto" w:fill="F5F5F4"/>
+          </w:tcPr>
+          <w:p>
+            <w:pPr>
+              <w:spacing w:after="0"/>
+            </w:pPr>
+            <w:r>
+              <w:rPr>
+                <w:b/>
+                <w:sz w:val="19"/>
+              </w:rPr>
+              <w:t>notes</w:t>
+            </w:r>
+          </w:p>
+        </w:tc>
+      </w:tr>
+      <w:tr>
+        <w:tc>
+          <w:tcPr>
+            <w:tcW w:type="dxa" w:w="2660"/>
+          </w:tcPr>
+          <w:p>
+            <w:pPr>
+              <w:spacing w:after="0"/>
+            </w:pPr>
+            <w:r>
+              <w:rPr>
+                <w:b/>
+                <w:sz w:val="19"/>
+              </w:rPr>
+              <w:t>Pesto</w:t>
+            </w:r>
+          </w:p>
+        </w:tc>
+        <w:tc>
+          <w:tcPr>
+            <w:tcW w:type="dxa" w:w="2660"/>
+          </w:tcPr>
+          <w:p>
+            <w:pPr>
+              <w:spacing w:after="0"/>
+            </w:pPr>
+            <w:hyperlink r:id="rId103">
+              <w:r>
+                <w:rPr>
+                  <w:color w:val="7F1D3A"/>
+                  <w:u w:val="single"/>
+                  <w:sz w:val="19"/>
+                </w:rPr>
+                <w:t xml:space="preserve">apps.pesto.tech/developer/registration</w:t>
+              </w:r>
+            </w:hyperlink>
+          </w:p>
+        </w:tc>
+        <w:tc>
+          <w:tcPr>
+            <w:tcW w:type="dxa" w:w="2660"/>
+          </w:tcPr>
+          <w:p>
+            <w:pPr>
+              <w:spacing w:after="0"/>
+            </w:pPr>
+            <w:r>
+              <w:rPr>
+                <w:b/>
+                <w:sz w:val="19"/>
+              </w:rPr>
+              <w:t>Free</w:t>
+            </w:r>
+            <w:r>
+              <w:rPr>
+                <w:sz w:val="19"/>
+              </w:rPr>
+              <w:t>; "charges hiring partners, not developers"</w:t>
+            </w:r>
+          </w:p>
+        </w:tc>
+        <w:tc>
+          <w:tcPr>
+            <w:tcW w:type="dxa" w:w="2660"/>
+          </w:tcPr>
+          <w:p>
+            <w:pPr>
+              <w:spacing w:after="0"/>
+            </w:pPr>
+            <w:r>
+              <w:rPr>
+                <w:b/>
+                <w:sz w:val="19"/>
+              </w:rPr>
+              <w:t>Requires 4+ years</w:t>
+            </w:r>
+            <w:r>
+              <w:rPr>
+                <w:sz w:val="19"/>
+              </w:rPr>
+              <w:t xml:space="preserve"> on full-stack, </w:t>
+            </w:r>
+            <w:r>
+              <w:rPr>
+                <w:b/>
+                <w:sz w:val="19"/>
+              </w:rPr>
+              <w:t>MERN</w:t>
+            </w:r>
+            <w:r>
+              <w:rPr>
+                <w:sz w:val="19"/>
+              </w:rPr>
+              <w:t xml:space="preserve">, frontend or backend. Places into full-time roles; past partners named on the page: Swiggy, Razorpay, Amazon, Flipkart, Clipboard Health, Pulley. </w:t>
+            </w:r>
+            <w:r>
+              <w:rPr>
+                <w:rFonts w:ascii="Consolas" w:hAnsi="Consolas"/>
+                <w:sz w:val="17"/>
+              </w:rPr>
+              <w:t>support@pesto.tech</w:t>
+            </w:r>
+          </w:p>
+        </w:tc>
+      </w:tr>
+      <w:tr>
+        <w:tc>
+          <w:tcPr>
+            <w:tcW w:type="dxa" w:w="2660"/>
+          </w:tcPr>
+          <w:p>
+            <w:pPr>
+              <w:spacing w:after="0"/>
+            </w:pPr>
+            <w:r>
+              <w:rPr>
+                <w:b/>
+                <w:sz w:val="19"/>
+              </w:rPr>
+              <w:t>Talent500</w:t>
+            </w:r>
+            <w:r>
+              <w:rPr>
+                <w:sz w:val="19"/>
+              </w:rPr>
+              <w:t xml:space="preserve"> (ANSR)</w:t>
+            </w:r>
+          </w:p>
+        </w:tc>
+        <w:tc>
+          <w:tcPr>
+            <w:tcW w:type="dxa" w:w="2660"/>
+          </w:tcPr>
+          <w:p>
+            <w:pPr>
+              <w:spacing w:after="0"/>
+            </w:pPr>
+            <w:hyperlink r:id="rId104">
+              <w:r>
+                <w:rPr>
+                  <w:color w:val="7F1D3A"/>
+                  <w:u w:val="single"/>
+                  <w:sz w:val="19"/>
+                </w:rPr>
+                <w:t xml:space="preserve">talent500.com/auth/signup</w:t>
+              </w:r>
+            </w:hyperlink>
+          </w:p>
+        </w:tc>
+        <w:tc>
+          <w:tcPr>
+            <w:tcW w:type="dxa" w:w="2660"/>
+          </w:tcPr>
+          <w:p>
+            <w:pPr>
+              <w:spacing w:after="0"/>
+            </w:pPr>
+            <w:r>
+              <w:rPr>
+                <w:sz w:val="19"/>
+              </w:rPr>
+              <w:t>not stated on page</w:t>
+            </w:r>
+          </w:p>
+        </w:tc>
+        <w:tc>
+          <w:tcPr>
+            <w:tcW w:type="dxa" w:w="2660"/>
+          </w:tcPr>
+          <w:p>
+            <w:pPr>
+              <w:spacing w:after="0"/>
+            </w:pPr>
+            <w:r>
+              <w:rPr>
+                <w:sz w:val="19"/>
+              </w:rPr>
+              <w:t>Roles at Global Capability Centres in India. AI-matched. The site calls itself "premium" but publishes no candidate fee; confirm at sign-up</w:t>
+            </w:r>
+          </w:p>
+        </w:tc>
+      </w:tr>
+    </w:tbl>
+    <w:p/>
+    <w:p>
+      <w:r>
+        <w:t>Pesto is the strongest single entry in this document for your profile: it is free, it names MERN, and your experience clears the bar.</w:t>
+      </w:r>
+    </w:p>
+    <w:p>
+      <w:r>
+        <w:t>Part 1 flagged Pesto for a historical income-share model. Their current developer page says free; the earlier flag is withdrawn.</w:t>
+      </w:r>
+    </w:p>
+    <w:p>
+      <w:pPr>
+        <w:pStyle w:val="Heading1"/>
+      </w:pPr>
+      <w:r>
+        <w:t>12. Someone applies for you, paid after placement or per application</w:t>
+      </w:r>
+    </w:p>
+    <w:p>
+      <w:r>
+        <w:t xml:space="preserve">All of these target remote US roles unless noted. </w:t>
+      </w:r>
+      <w:r>
+        <w:rPr>
+          <w:b/>
+        </w:rPr>
+        <w:t>None of them states on its site whether an India-based candidate is accepted</w:t>
+      </w:r>
+      <w:r>
+        <w:t>, so ask before paying. Fees are quoted verbatim from each firm's own pricing page.</w:t>
+      </w:r>
+    </w:p>
+    <w:tbl>
+      <w:tblPr>
+        <w:tblStyle w:val="TableGrid"/>
+        <w:tblW w:type="auto" w:w="0"/>
+        <w:jc w:val="center"/>
+        <w:tblLook w:firstColumn="1" w:firstRow="1" w:lastColumn="0" w:lastRow="0" w:noHBand="0" w:noVBand="1" w:val="04A0"/>
+      </w:tblPr>
+      <w:tblGrid>
+        <w:gridCol w:w="2660"/>
+        <w:gridCol w:w="2660"/>
+        <w:gridCol w:w="2660"/>
+        <w:gridCol w:w="2660"/>
+      </w:tblGrid>
+      <w:tr>
+        <w:tc>
+          <w:tcPr>
+            <w:tcW w:type="dxa" w:w="2660"/>
+            <w:shd w:val="clear" w:color="auto" w:fill="F5F5F4"/>
+          </w:tcPr>
+          <w:p>
+            <w:pPr>
+              <w:spacing w:after="0"/>
+            </w:pPr>
+            <w:r>
+              <w:rPr>
+                <w:b/>
+                <w:sz w:val="19"/>
+              </w:rPr>
+              <w:t>service</w:t>
+            </w:r>
+          </w:p>
+        </w:tc>
+        <w:tc>
+          <w:tcPr>
+            <w:tcW w:type="dxa" w:w="2660"/>
+            <w:shd w:val="clear" w:color="auto" w:fill="F5F5F4"/>
+          </w:tcPr>
+          <w:p>
+            <w:pPr>
+              <w:spacing w:after="0"/>
+            </w:pPr>
+            <w:r>
+              <w:rPr>
+                <w:b/>
+                <w:sz w:val="19"/>
+              </w:rPr>
+              <w:t>fee model</w:t>
+            </w:r>
+          </w:p>
+        </w:tc>
+        <w:tc>
+          <w:tcPr>
+            <w:tcW w:type="dxa" w:w="2660"/>
+            <w:shd w:val="clear" w:color="auto" w:fill="F5F5F4"/>
+          </w:tcPr>
+          <w:p>
+            <w:pPr>
+              <w:spacing w:after="0"/>
+            </w:pPr>
+            <w:r>
+              <w:rPr>
+                <w:b/>
+                <w:sz w:val="19"/>
+              </w:rPr>
+              <w:t>what you get</w:t>
+            </w:r>
+          </w:p>
+        </w:tc>
+        <w:tc>
+          <w:tcPr>
+            <w:tcW w:type="dxa" w:w="2660"/>
+            <w:shd w:val="clear" w:color="auto" w:fill="F5F5F4"/>
+          </w:tcPr>
+          <w:p>
+            <w:pPr>
+              <w:spacing w:after="0"/>
+            </w:pPr>
+            <w:r>
+              <w:rPr>
+                <w:b/>
+                <w:sz w:val="19"/>
+              </w:rPr>
+              <w:t>sign up</w:t>
+            </w:r>
+          </w:p>
+        </w:tc>
+      </w:tr>
+      <w:tr>
+        <w:tc>
+          <w:tcPr>
+            <w:tcW w:type="dxa" w:w="2660"/>
+          </w:tcPr>
+          <w:p>
+            <w:pPr>
+              <w:spacing w:after="0"/>
+            </w:pPr>
+            <w:r>
+              <w:rPr>
+                <w:b/>
+                <w:sz w:val="19"/>
+              </w:rPr>
+              <w:t>Reverse Recruiting Agency</w:t>
+            </w:r>
+          </w:p>
+        </w:tc>
+        <w:tc>
+          <w:tcPr>
+            <w:tcW w:type="dxa" w:w="2660"/>
+          </w:tcPr>
+          <w:p>
+            <w:pPr>
+              <w:spacing w:after="0"/>
+            </w:pPr>
+            <w:r>
+              <w:rPr>
+                <w:rFonts w:ascii="Consolas" w:hAnsi="Consolas"/>
+                <w:sz w:val="17"/>
+              </w:rPr>
+              <w:t>$1,500</w:t>
+            </w:r>
+            <w:r>
+              <w:rPr>
+                <w:sz w:val="19"/>
+              </w:rPr>
+              <w:t xml:space="preserve">/month + </w:t>
+            </w:r>
+            <w:r>
+              <w:rPr>
+                <w:rFonts w:ascii="Consolas" w:hAnsi="Consolas"/>
+                <w:sz w:val="17"/>
+              </w:rPr>
+              <w:t>10% of first-year salary upon job acceptance</w:t>
+            </w:r>
+            <w:r>
+              <w:rPr>
+                <w:sz w:val="19"/>
+              </w:rPr>
+              <w:t xml:space="preserve">. First month refunded when you land the job; monthly fee </w:t>
+            </w:r>
+            <w:r>
+              <w:rPr>
+                <w:rFonts w:ascii="Consolas" w:hAnsi="Consolas"/>
+                <w:sz w:val="17"/>
+              </w:rPr>
+              <w:t>fully refundable within 30 days</w:t>
+            </w:r>
+          </w:p>
+        </w:tc>
+        <w:tc>
+          <w:tcPr>
+            <w:tcW w:type="dxa" w:w="2660"/>
+          </w:tcPr>
+          <w:p>
+            <w:pPr>
+              <w:spacing w:after="0"/>
+            </w:pPr>
+            <w:r>
+              <w:rPr>
+                <w:rFonts w:ascii="Consolas" w:hAnsi="Consolas"/>
+                <w:sz w:val="17"/>
+              </w:rPr>
+              <w:t>50-100 applications/week</w:t>
+            </w:r>
+            <w:r>
+              <w:rPr>
+                <w:sz w:val="19"/>
+              </w:rPr>
+              <w:t xml:space="preserve">, resume and LinkedIn rewrite, daily recruiter outreach, interview prep, negotiation. Guarantee: </w:t>
+            </w:r>
+            <w:r>
+              <w:rPr>
+                <w:rFonts w:ascii="Consolas" w:hAnsi="Consolas"/>
+                <w:sz w:val="17"/>
+              </w:rPr>
+              <w:t>9 interviews in your first 3 months or your money back</w:t>
+            </w:r>
+          </w:p>
+        </w:tc>
+        <w:tc>
+          <w:tcPr>
+            <w:tcW w:type="dxa" w:w="2660"/>
+          </w:tcPr>
+          <w:p>
+            <w:pPr>
+              <w:spacing w:after="0"/>
+            </w:pPr>
+            <w:hyperlink r:id="rId105">
+              <w:r>
+                <w:rPr>
+                  <w:color w:val="7F1D3A"/>
+                  <w:u w:val="single"/>
+                  <w:sz w:val="19"/>
+                </w:rPr>
+                <w:t xml:space="preserve">www.reverserecruitingagency.com/contact</w:t>
+              </w:r>
+            </w:hyperlink>
+          </w:p>
+        </w:tc>
+      </w:tr>
+      <w:tr>
+        <w:tc>
+          <w:tcPr>
+            <w:tcW w:type="dxa" w:w="2660"/>
+          </w:tcPr>
+          <w:p>
+            <w:pPr>
+              <w:spacing w:after="0"/>
+            </w:pPr>
+            <w:r>
+              <w:rPr>
+                <w:b/>
+                <w:sz w:val="19"/>
+              </w:rPr>
+              <w:t>Find My Profession</w:t>
+            </w:r>
+          </w:p>
+        </w:tc>
+        <w:tc>
+          <w:tcPr>
+            <w:tcW w:type="dxa" w:w="2660"/>
+          </w:tcPr>
+          <w:p>
+            <w:pPr>
+              <w:spacing w:after="0"/>
+            </w:pPr>
+            <w:r>
+              <w:rPr>
+                <w:sz w:val="19"/>
+              </w:rPr>
+              <w:t xml:space="preserve">From </w:t>
+            </w:r>
+            <w:r>
+              <w:rPr>
+                <w:rFonts w:ascii="Consolas" w:hAnsi="Consolas"/>
+                <w:sz w:val="17"/>
+              </w:rPr>
+              <w:t>$1,500/month + 8% success fee</w:t>
+            </w:r>
+            <w:r>
+              <w:rPr>
+                <w:sz w:val="19"/>
+              </w:rPr>
+              <w:t xml:space="preserve">, or </w:t>
+            </w:r>
+            <w:r>
+              <w:rPr>
+                <w:rFonts w:ascii="Consolas" w:hAnsi="Consolas"/>
+                <w:sz w:val="17"/>
+              </w:rPr>
+              <w:t>$3,000/month</w:t>
+            </w:r>
+            <w:r>
+              <w:rPr>
+                <w:sz w:val="19"/>
+              </w:rPr>
+              <w:t xml:space="preserve"> flat (per their own guide; the service page did not render, so confirm on a call)</w:t>
+            </w:r>
+          </w:p>
+        </w:tc>
+        <w:tc>
+          <w:tcPr>
+            <w:tcW w:type="dxa" w:w="2660"/>
+          </w:tcPr>
+          <w:p>
+            <w:pPr>
+              <w:spacing w:after="0"/>
+            </w:pPr>
+            <w:r>
+              <w:rPr>
+                <w:sz w:val="19"/>
+              </w:rPr>
+              <w:t>Applies on your behalf; describes itself as one of the few reverse recruiters that do</w:t>
+            </w:r>
+          </w:p>
+        </w:tc>
+        <w:tc>
+          <w:tcPr>
+            <w:tcW w:type="dxa" w:w="2660"/>
+          </w:tcPr>
+          <w:p>
+            <w:pPr>
+              <w:spacing w:after="0"/>
+            </w:pPr>
+            <w:hyperlink r:id="rId106">
+              <w:r>
+                <w:rPr>
+                  <w:color w:val="7F1D3A"/>
+                  <w:u w:val="single"/>
+                  <w:sz w:val="19"/>
+                </w:rPr>
+                <w:t xml:space="preserve">www.findmyprofession.com/reverse-recruiting/</w:t>
+              </w:r>
+            </w:hyperlink>
+          </w:p>
+        </w:tc>
+      </w:tr>
+      <w:tr>
+        <w:tc>
+          <w:tcPr>
+            <w:tcW w:type="dxa" w:w="2660"/>
+          </w:tcPr>
+          <w:p>
+            <w:pPr>
+              <w:spacing w:after="0"/>
+            </w:pPr>
+            <w:r>
+              <w:rPr>
+                <w:b/>
+                <w:sz w:val="19"/>
+              </w:rPr>
+              <w:t>My Personal Recruiter</w:t>
+            </w:r>
+          </w:p>
+        </w:tc>
+        <w:tc>
+          <w:tcPr>
+            <w:tcW w:type="dxa" w:w="2660"/>
+          </w:tcPr>
+          <w:p>
+            <w:pPr>
+              <w:spacing w:after="0"/>
+            </w:pPr>
+            <w:r>
+              <w:rPr>
+                <w:rFonts w:ascii="Consolas" w:hAnsi="Consolas"/>
+                <w:sz w:val="17"/>
+              </w:rPr>
+              <w:t>$899</w:t>
+            </w:r>
+            <w:r>
+              <w:rPr>
+                <w:sz w:val="19"/>
+              </w:rPr>
+              <w:t xml:space="preserve">, </w:t>
+            </w:r>
+            <w:r>
+              <w:rPr>
+                <w:rFonts w:ascii="Consolas" w:hAnsi="Consolas"/>
+                <w:sz w:val="17"/>
+              </w:rPr>
+              <w:t>$1,499</w:t>
+            </w:r>
+            <w:r>
+              <w:rPr>
+                <w:sz w:val="19"/>
+              </w:rPr>
+              <w:t xml:space="preserve"> or </w:t>
+            </w:r>
+            <w:r>
+              <w:rPr>
+                <w:rFonts w:ascii="Consolas" w:hAnsi="Consolas"/>
+                <w:sz w:val="17"/>
+              </w:rPr>
+              <w:t>$2,499</w:t>
+            </w:r>
+            <w:r>
+              <w:rPr>
+                <w:sz w:val="19"/>
+              </w:rPr>
+              <w:t xml:space="preserve"> per month. No success fee. Guarantee: if no written offer within six months, service continues at no extra cost</w:t>
+            </w:r>
+          </w:p>
+        </w:tc>
+        <w:tc>
+          <w:tcPr>
+            <w:tcW w:type="dxa" w:w="2660"/>
+          </w:tcPr>
+          <w:p>
+            <w:pPr>
+              <w:spacing w:after="0"/>
+            </w:pPr>
+            <w:r>
+              <w:rPr>
+                <w:sz w:val="19"/>
+              </w:rPr>
+              <w:t xml:space="preserve">Dedicated recruiter builds target lists, applies, contacts hiring managers, negotiates. Volume not stated. Miami, US phone </w:t>
+            </w:r>
+            <w:r>
+              <w:rPr>
+                <w:rFonts w:ascii="Consolas" w:hAnsi="Consolas"/>
+                <w:sz w:val="17"/>
+              </w:rPr>
+              <w:t>800-500-7760</w:t>
+            </w:r>
+          </w:p>
+        </w:tc>
+        <w:tc>
+          <w:tcPr>
+            <w:tcW w:type="dxa" w:w="2660"/>
+          </w:tcPr>
+          <w:p>
+            <w:pPr>
+              <w:spacing w:after="0"/>
+            </w:pPr>
+            <w:hyperlink r:id="rId107">
+              <w:r>
+                <w:rPr>
+                  <w:color w:val="7F1D3A"/>
+                  <w:u w:val="single"/>
+                  <w:sz w:val="19"/>
+                </w:rPr>
+                <w:t xml:space="preserve">app.mypersonalrecruiter.com/</w:t>
+              </w:r>
+            </w:hyperlink>
+          </w:p>
+        </w:tc>
+      </w:tr>
+      <w:tr>
+        <w:tc>
+          <w:tcPr>
+            <w:tcW w:type="dxa" w:w="2660"/>
+          </w:tcPr>
+          <w:p>
+            <w:pPr>
+              <w:spacing w:after="0"/>
+            </w:pPr>
+            <w:r>
+              <w:rPr>
+                <w:b/>
+                <w:sz w:val="19"/>
+              </w:rPr>
+              <w:t>Careerify</w:t>
+            </w:r>
+          </w:p>
+        </w:tc>
+        <w:tc>
+          <w:tcPr>
+            <w:tcW w:type="dxa" w:w="2660"/>
+          </w:tcPr>
+          <w:p>
+            <w:pPr>
+              <w:spacing w:after="0"/>
+            </w:pPr>
+            <w:r>
+              <w:rPr>
+                <w:rFonts w:ascii="Consolas" w:hAnsi="Consolas"/>
+                <w:sz w:val="17"/>
+              </w:rPr>
+              <w:t>$150–$720 a month</w:t>
+            </w:r>
+            <w:r>
+              <w:rPr>
+                <w:sz w:val="19"/>
+              </w:rPr>
+              <w:t xml:space="preserve"> for </w:t>
+            </w:r>
+            <w:r>
+              <w:rPr>
+                <w:rFonts w:ascii="Consolas" w:hAnsi="Consolas"/>
+                <w:sz w:val="17"/>
+              </w:rPr>
+              <w:t>~50–300 applications</w:t>
+            </w:r>
+            <w:r>
+              <w:rPr>
+                <w:sz w:val="19"/>
+              </w:rPr>
+              <w:t>. 5-day free trial. No success fee</w:t>
+            </w:r>
+          </w:p>
+        </w:tc>
+        <w:tc>
+          <w:tcPr>
+            <w:tcW w:type="dxa" w:w="2660"/>
+          </w:tcPr>
+          <w:p>
+            <w:pPr>
+              <w:spacing w:after="0"/>
+            </w:pPr>
+            <w:r>
+              <w:rPr>
+                <w:sz w:val="19"/>
+              </w:rPr>
+              <w:t>A human (offshore) recruiter checks fit and submits each application with the right resume version; every submission logged to your dashboard</w:t>
+            </w:r>
+          </w:p>
+        </w:tc>
+        <w:tc>
+          <w:tcPr>
+            <w:tcW w:type="dxa" w:w="2660"/>
+          </w:tcPr>
+          <w:p>
+            <w:pPr>
+              <w:spacing w:after="0"/>
+            </w:pPr>
+            <w:hyperlink r:id="rId108">
+              <w:r>
+                <w:rPr>
+                  <w:color w:val="7F1D3A"/>
+                  <w:u w:val="single"/>
+                  <w:sz w:val="19"/>
+                </w:rPr>
+                <w:t xml:space="preserve">dashboard.careerify.io/signup</w:t>
+              </w:r>
+            </w:hyperlink>
+          </w:p>
+        </w:tc>
+      </w:tr>
+      <w:tr>
+        <w:tc>
+          <w:tcPr>
+            <w:tcW w:type="dxa" w:w="2660"/>
+          </w:tcPr>
+          <w:p>
+            <w:pPr>
+              <w:spacing w:after="0"/>
+            </w:pPr>
+            <w:r>
+              <w:rPr>
+                <w:b/>
+                <w:sz w:val="19"/>
+              </w:rPr>
+              <w:t>Scale.jobs</w:t>
+            </w:r>
+          </w:p>
+        </w:tc>
+        <w:tc>
+          <w:tcPr>
+            <w:tcW w:type="dxa" w:w="2660"/>
+          </w:tcPr>
+          <w:p>
+            <w:pPr>
+              <w:spacing w:after="0"/>
+            </w:pPr>
+            <w:r>
+              <w:rPr>
+                <w:sz w:val="19"/>
+              </w:rPr>
+              <w:t xml:space="preserve">One-time: </w:t>
+            </w:r>
+            <w:r>
+              <w:rPr>
+                <w:rFonts w:ascii="Consolas" w:hAnsi="Consolas"/>
+                <w:sz w:val="17"/>
+              </w:rPr>
+              <w:t>$199</w:t>
+            </w:r>
+            <w:r>
+              <w:rPr>
+                <w:sz w:val="19"/>
+              </w:rPr>
+              <w:t xml:space="preserve"> / 250 applications, </w:t>
+            </w:r>
+            <w:r>
+              <w:rPr>
+                <w:rFonts w:ascii="Consolas" w:hAnsi="Consolas"/>
+                <w:sz w:val="17"/>
+              </w:rPr>
+              <w:t>$299</w:t>
+            </w:r>
+            <w:r>
+              <w:rPr>
+                <w:sz w:val="19"/>
+              </w:rPr>
+              <w:t xml:space="preserve"> / 500, </w:t>
+            </w:r>
+            <w:r>
+              <w:rPr>
+                <w:rFonts w:ascii="Consolas" w:hAnsi="Consolas"/>
+                <w:sz w:val="17"/>
+              </w:rPr>
+              <w:t>$399</w:t>
+            </w:r>
+            <w:r>
+              <w:rPr>
+                <w:sz w:val="19"/>
+              </w:rPr>
+              <w:t xml:space="preserve"> / 1,000, </w:t>
+            </w:r>
+            <w:r>
+              <w:rPr>
+                <w:rFonts w:ascii="Consolas" w:hAnsi="Consolas"/>
+                <w:sz w:val="17"/>
+              </w:rPr>
+              <w:t>$1,099</w:t>
+            </w:r>
+            <w:r>
+              <w:rPr>
+                <w:sz w:val="19"/>
+              </w:rPr>
+              <w:t xml:space="preserve"> bundle. Unused credits refundable</w:t>
+            </w:r>
+          </w:p>
+        </w:tc>
+        <w:tc>
+          <w:tcPr>
+            <w:tcW w:type="dxa" w:w="2660"/>
+          </w:tcPr>
+          <w:p>
+            <w:pPr>
+              <w:spacing w:after="0"/>
+            </w:pPr>
+            <w:r>
+              <w:rPr>
+                <w:sz w:val="19"/>
+              </w:rPr>
+              <w:t>Human assistants fill every form, screenshot proof per application, strategy review every 15 days. Testimonials include Indian candidates and H-1B roles</w:t>
+            </w:r>
+          </w:p>
+        </w:tc>
+        <w:tc>
+          <w:tcPr>
+            <w:tcW w:type="dxa" w:w="2660"/>
+          </w:tcPr>
+          <w:p>
+            <w:pPr>
+              <w:spacing w:after="0"/>
+            </w:pPr>
+            <w:hyperlink r:id="rId109">
+              <w:r>
+                <w:rPr>
+                  <w:color w:val="7F1D3A"/>
+                  <w:u w:val="single"/>
+                  <w:sz w:val="19"/>
+                </w:rPr>
+                <w:t xml:space="preserve">scale.jobs/sign-up</w:t>
+              </w:r>
+            </w:hyperlink>
+          </w:p>
+        </w:tc>
+      </w:tr>
+      <w:tr>
+        <w:tc>
+          <w:tcPr>
+            <w:tcW w:type="dxa" w:w="2660"/>
+          </w:tcPr>
+          <w:p>
+            <w:pPr>
+              <w:spacing w:after="0"/>
+            </w:pPr>
+            <w:r>
+              <w:rPr>
+                <w:b/>
+                <w:sz w:val="19"/>
+              </w:rPr>
+              <w:t>ApplyPass</w:t>
+            </w:r>
+          </w:p>
+        </w:tc>
+        <w:tc>
+          <w:tcPr>
+            <w:tcW w:type="dxa" w:w="2660"/>
+          </w:tcPr>
+          <w:p>
+            <w:pPr>
+              <w:spacing w:after="0"/>
+            </w:pPr>
+            <w:r>
+              <w:rPr>
+                <w:sz w:val="19"/>
+              </w:rPr>
+              <w:t>100 applications free, then paid tiers (pricing page not read)</w:t>
+            </w:r>
+          </w:p>
+        </w:tc>
+        <w:tc>
+          <w:tcPr>
+            <w:tcW w:type="dxa" w:w="2660"/>
+          </w:tcPr>
+          <w:p>
+            <w:pPr>
+              <w:spacing w:after="0"/>
+            </w:pPr>
+            <w:r>
+              <w:rPr>
+                <w:b/>
+                <w:sz w:val="19"/>
+              </w:rPr>
+              <w:t>Automated</w:t>
+            </w:r>
+            <w:r>
+              <w:rPr>
+                <w:sz w:val="19"/>
+              </w:rPr>
+              <w:t xml:space="preserve">, not human: </w:t>
+            </w:r>
+            <w:r>
+              <w:rPr>
+                <w:rFonts w:ascii="Consolas" w:hAnsi="Consolas"/>
+                <w:sz w:val="17"/>
+              </w:rPr>
+              <w:t>auto-applies to 400+ software engineering jobs weekly</w:t>
+            </w:r>
+            <w:r>
+              <w:rPr>
+                <w:sz w:val="19"/>
+              </w:rPr>
+              <w:t>. Built for software engineers</w:t>
+            </w:r>
+          </w:p>
+        </w:tc>
+        <w:tc>
+          <w:tcPr>
+            <w:tcW w:type="dxa" w:w="2660"/>
+          </w:tcPr>
+          <w:p>
+            <w:pPr>
+              <w:spacing w:after="0"/>
+            </w:pPr>
+            <w:hyperlink r:id="rId110">
+              <w:r>
+                <w:rPr>
+                  <w:color w:val="7F1D3A"/>
+                  <w:u w:val="single"/>
+                  <w:sz w:val="19"/>
+                </w:rPr>
+                <w:t xml:space="preserve">app.applypass.com/sign-up</w:t>
+              </w:r>
+            </w:hyperlink>
+          </w:p>
+        </w:tc>
+      </w:tr>
+    </w:tbl>
+    <w:p/>
+    <w:p>
+      <w:r>
+        <w:t>Which to pick, if any:</w:t>
+      </w:r>
+    </w:p>
+    <w:p>
+      <w:pPr>
+        <w:pStyle w:val="ListBullet"/>
+      </w:pPr>
+      <w:r>
+        <w:rPr>
+          <w:b/>
+        </w:rPr>
+        <w:t>Scale.jobs</w:t>
+      </w:r>
+      <w:r>
+        <w:t xml:space="preserve"> is the cheap volume play: a few hundred dollars once, humans</w:t>
+      </w:r>
+    </w:p>
+    <w:p>
+      <w:r>
+        <w:t>doing the forms, no percentage of your salary.</w:t>
+      </w:r>
+    </w:p>
+    <w:p>
+      <w:pPr>
+        <w:pStyle w:val="ListBullet"/>
+      </w:pPr>
+      <w:r>
+        <w:rPr>
+          <w:b/>
+        </w:rPr>
+        <w:t>Reverse Recruiting Agency</w:t>
+      </w:r>
+      <w:r>
+        <w:t xml:space="preserve"> is the real "pay after placement" model: the</w:t>
+      </w:r>
+    </w:p>
+    <w:p>
+      <w:r>
+        <w:t>10% success fee is only due on acceptance and the first month comes back. On a USD salary that fee is large; on an Indian salary it would be modest.</w:t>
+      </w:r>
+    </w:p>
+    <w:p>
+      <w:pPr>
+        <w:pStyle w:val="ListBullet"/>
+      </w:pPr>
+      <w:r>
+        <w:rPr>
+          <w:b/>
+        </w:rPr>
+        <w:t>Careerify</w:t>
+      </w:r>
+      <w:r>
+        <w:t xml:space="preserve"> is the middle: monthly, human, no success fee, free trial.</w:t>
+      </w:r>
+    </w:p>
+    <w:p>
+      <w:pPr>
+        <w:pStyle w:val="ListBullet"/>
+      </w:pPr>
+      <w:r>
+        <w:t>Everything else here is US-priced coaching. Skip unless you are specifically</w:t>
+      </w:r>
+    </w:p>
+    <w:p>
+      <w:r>
+        <w:t>targeting US remote and can fund it for three months.</w:t>
+      </w:r>
+    </w:p>
+    <w:p>
+      <w:pPr>
+        <w:pStyle w:val="Heading1"/>
+      </w:pPr>
+      <w:r>
+        <w:t>13. Overseas placement agents: the rule, not a list</w:t>
+      </w:r>
+    </w:p>
+    <w:p>
+      <w:r>
+        <w:t>For Gulf and Europe you do not need a fee-charging agent for IT roles, and most of the ones that ask for money are the scams Part 1 warns about.</w:t>
+      </w:r>
+    </w:p>
+    <w:p>
+      <w:pPr>
+        <w:pStyle w:val="ListBullet"/>
+      </w:pPr>
+      <w:r>
+        <w:t>An agent recruiting Indians for jobs abroad must hold an MEA **Recruiting</w:t>
+      </w:r>
+    </w:p>
+    <w:p>
+      <w:r>
+        <w:t xml:space="preserve">Agent licence**. Check the licence on </w:t>
+      </w:r>
+      <w:hyperlink r:id="rId111">
+        <w:r>
+          <w:rPr>
+            <w:color w:val="7F1D3A"/>
+            <w:u w:val="single"/>
+          </w:rPr>
+          <w:t xml:space="preserve">emigrate.gov.in/</w:t>
+        </w:r>
+      </w:hyperlink>
+      <w:r>
+        <w:t xml:space="preserve"> before anything else. Unlicensed recruitment is an offence under the Emigration Act, 1983.</w:t>
+      </w:r>
+    </w:p>
+    <w:p>
+      <w:pPr>
+        <w:pStyle w:val="ListBullet"/>
+      </w:pPr>
+      <w:r>
+        <w:t xml:space="preserve">A licensed agent may charge at most </w:t>
+      </w:r>
+      <w:r>
+        <w:rPr>
+          <w:b/>
+        </w:rPr>
+        <w:t>₹30,000 + 18% GST (₹35,400)</w:t>
+      </w:r>
+      <w:r>
+        <w:t xml:space="preserve"> and must</w:t>
+      </w:r>
+    </w:p>
+    <w:p>
+      <w:r>
+        <w:t>give a receipt. Anything above that, or any "processing fee" by WhatsApp, is the signal to walk.</w:t>
+      </w:r>
+    </w:p>
+    <w:p>
+      <w:pPr>
+        <w:pStyle w:val="ListBullet"/>
+      </w:pPr>
+      <w:r>
+        <w:t>IT roles are not Emigration-Check-Required, so the Gulf agencies in Part 1 §3</w:t>
+      </w:r>
+    </w:p>
+    <w:p>
+      <w:r>
+        <w:t>(Halian, TASC, Michael Page UAE, Hays UAE) are the correct route, and in the UAE the law forbids charging the candidate at all.</w:t>
+      </w:r>
+    </w:p>
+    <w:p>
+      <w:pPr>
+        <w:pStyle w:val="Heading1"/>
+      </w:pPr>
+      <w:r>
+        <w:t>14. Pay-after-placement training programmes, for reference only</w:t>
+      </w:r>
+    </w:p>
+    <w:p>
+      <w:r>
+        <w:t xml:space="preserve">These came up in the search and are candidate-paid after placement, but they are </w:t>
+      </w:r>
+      <w:r>
+        <w:rPr>
+          <w:b/>
+        </w:rPr>
+        <w:t>training bundled with placement</w:t>
+      </w:r>
+      <w:r>
+        <w:t>, built for freshers and early-career switchers. Not a fit for five years of experience; listed so you know what they are when they advertise to you.</w:t>
+      </w:r>
+    </w:p>
+    <w:p>
+      <w:r>
+        <w:t>Intellipaat (tuition after a 5 LPA job), AccioJob (income-share agreement), Placewit (pay when placed above a minimum CTC), Edufect (40% during, 60% after joining), Sharpener Tech (deposit refunded per terms).</w:t>
+      </w:r>
+    </w:p>
+    <w:p>
+      <w:pPr>
+        <w:pStyle w:val="Heading1"/>
+      </w:pPr>
+      <w:r>
+        <w:t>15. Order of operations for the fast lane</w:t>
+      </w:r>
+    </w:p>
+    <w:p>
+      <w:pPr>
+        <w:pStyle w:val="ListNumber"/>
+      </w:pPr>
+      <w:r>
+        <w:rPr>
+          <w:b/>
+        </w:rPr>
+        <w:t>Today, free:</w:t>
+      </w:r>
+      <w:r>
+        <w:t xml:space="preserve"> Pesto registration, Talent500 sign-up, Cybotrix sign-up (ask</w:t>
+      </w:r>
+    </w:p>
+    <w:p>
+      <w:r>
+        <w:t>for the fee terms in writing in the same message).</w:t>
+      </w:r>
+    </w:p>
+    <w:p>
+      <w:pPr>
+        <w:pStyle w:val="ListNumber"/>
+      </w:pPr>
+      <w:r>
+        <w:rPr>
+          <w:b/>
+        </w:rPr>
+        <w:t>Today, one email each:</w:t>
+      </w:r>
+      <w:r>
+        <w:t xml:space="preserve"> WSNE, Bloom, TeamPlus, SRI Tech with the résumé</w:t>
+      </w:r>
+    </w:p>
+    <w:p>
+      <w:r>
+        <w:t xml:space="preserve">attached and the stack in the subject line. Draft them from </w:t>
+      </w:r>
+      <w:r>
+        <w:rPr>
+          <w:rFonts w:ascii="Consolas" w:hAnsi="Consolas"/>
+          <w:sz w:val="20"/>
+        </w:rPr>
+        <w:t>/outreach</w:t>
+      </w:r>
+      <w:r>
+        <w:t xml:space="preserve"> in agency mode.</w:t>
+      </w:r>
+    </w:p>
+    <w:p>
+      <w:pPr>
+        <w:pStyle w:val="ListNumber"/>
+      </w:pPr>
+      <w:r>
+        <w:rPr>
+          <w:b/>
+        </w:rPr>
+        <w:t>This week:</w:t>
+      </w:r>
+      <w:r>
+        <w:t xml:space="preserve"> apply to the EZEU Cutshort listings that fit and message</w:t>
+      </w:r>
+    </w:p>
+    <w:p>
+      <w:r>
+        <w:t>Lakshmi PH on LinkedIn; expect a slow reply.</w:t>
+      </w:r>
+    </w:p>
+    <w:p>
+      <w:pPr>
+        <w:pStyle w:val="ListNumber"/>
+      </w:pPr>
+      <w:r>
+        <w:rPr>
+          <w:b/>
+        </w:rPr>
+        <w:t>Only if targeting US remote:</w:t>
+      </w:r>
+      <w:r>
+        <w:t xml:space="preserve"> Scale.jobs first (cheap, humans), Reverse</w:t>
+      </w:r>
+    </w:p>
+    <w:p>
+      <w:r>
+        <w:t>Recruiting Agency second (success fee). Ask both whether they take India-based candidates before paying.</w:t>
       </w:r>
     </w:p>
     <w:sectPr>

</xml_diff>